<commit_message>
docs: update NovaSprint implementation guide
</commit_message>
<xml_diff>
--- a/docs/NovaSprint_Implementation_Guide_GoogleDocs.docx
+++ b/docs/NovaSprint_Implementation_Guide_GoogleDocs.docx
@@ -438,14 +438,6 @@
     </w:p>
     <w:p>
       <w:pPr>
-        <w:spacing w:after="120" w:line="269" w:lineRule="auto"/>
-      </w:pPr>
-      <w:r>
-        <w:t>Before choosing an architecture, state what the agent does autonomously, what it hands to a person, and how the end-to-end workflow will be measured. The one-line definition below describes NovaSprint as it is implemented today; unknown targets are left explicit instead of guessed.</w:t>
-      </w:r>
-    </w:p>
-    <w:p>
-      <w:pPr>
         <w:pStyle w:val="Heading2"/>
         <w:keepNext/>
       </w:pPr>
@@ -458,41 +450,7 @@
         <w:spacing w:after="120" w:line="269" w:lineRule="auto"/>
       </w:pPr>
       <w:r>
-        <w:t>NovaSprint helps product teams turn a one-line sprint goal into an estimated, assigned and trackable Jira plan in a local web app, replacing manual task breakdown, forecasting, assignment and Jira entry; it reads team and Jira context, uses two integration categories (a configured LLM provider and Jira Cloud), publishes planned Jira work automatically, and hands the result to the team to inspect and track; end-to-end completion time and success-rate targets have not yet been measured.</w:t>
-      </w:r>
-    </w:p>
-    <w:p>
-      <w:pPr>
-        <w:pStyle w:val="Heading2"/>
-        <w:keepNext/>
-      </w:pPr>
-      <w:r>
-        <w:t>One-line template</w:t>
-      </w:r>
-    </w:p>
-    <w:p>
-      <w:pPr>
-        <w:spacing w:after="120" w:line="269" w:lineRule="auto"/>
-      </w:pPr>
-      <w:r>
-        <w:t>My agent helps [USER] do [MULTI-STEP TASK] in [SURFACE], replacing [MANUAL WORKFLOW AND COST]. It does [WORK] on its own using [N TOOLS], hands off to a human [WHEN], and I’ll know it works when [USER] can [COMPLETE THE TASK] in under [TIME] with [SUCCESS RATE].</w:t>
-      </w:r>
-    </w:p>
-    <w:p>
-      <w:pPr>
-        <w:pStyle w:val="Heading2"/>
-        <w:keepNext/>
-      </w:pPr>
-      <w:r>
-        <w:t>Worked example</w:t>
-      </w:r>
-    </w:p>
-    <w:p>
-      <w:pPr>
-        <w:spacing w:after="120" w:line="269" w:lineRule="auto"/>
-      </w:pPr>
-      <w:r>
-        <w:t>My agent helps a startup founder research a new market in a web app, replacing the 6 hours of manual googling and tab-juggling it takes to size up competitors today. It searches the web, pulls each competitor’s pricing and positioning, and drafts a one-page brief on its own using 4 tools, hands off to the founder to review before the brief gets saved, and I’ll know it works when a founder can get a usable market brief in under 15 minutes that they would actually send to their team 8 times out of 10.</w:t>
+        <w:t>NovaSprint helps product teams turn a one-line sprint goal into an ordered, estimated, assigned and trackable Jira plan in a local web app, replacing manual task breakdown, forecasting, assignment and issue entry; it reads team and Jira context, uses a configured LLM provider and Jira Cloud, publishes the planned Jira work automatically, and hands the result to the team to inspect and track; it works when a valid sprint goal produces a complete plan, every planned Jira issue is created, and Track can report their current status, with planning time measured from submission to publication.</w:t>
       </w:r>
     </w:p>
     <w:p>
@@ -792,7 +750,7 @@
         <w:spacing w:after="120" w:line="269" w:lineRule="auto"/>
       </w:pPr>
       <w:r>
-        <w:t>The framework below distinguishes the current implementation from measurement targets that still need to be set. It is grounded in the source code and does not claim unmeasured time savings or success rates.</w:t>
+        <w:t>The following framework maps NovaSprint’s user workflow, current capabilities and operating boundaries to each design field.</w:t>
       </w:r>
     </w:p>
     <w:tbl>
@@ -1411,7 +1369,7 @@
                 <w:color w:val="26364A"/>
                 <w:sz w:val="16"/>
               </w:rPr>
-              <w:t>Primary proposed measure: end-to-end plan-and-publish success rate—the share of valid goal runs that produce a complete task list and create every planned Jira issue that can then be checked by Track. Planning-time target and success-rate threshold are not yet instrumented or supplied.</w:t>
+              <w:t>End-to-end completion rate: the share of valid goal runs that produce a complete task list, create every planned Jira issue, and let Track report their current status. Measure planning time from goal submission to completed publication.</w:t>
             </w:r>
           </w:p>
         </w:tc>
@@ -1427,7 +1385,7 @@
         <w:spacing w:after="120" w:line="269" w:lineRule="auto"/>
       </w:pPr>
       <w:r>
-        <w:t>Measurement status: the code provides task counts, Jira publication outcomes, elapsed agent durations and tracking results, but it does not yet calculate a product-level completion-time baseline or an accepted-plan success rate. Set those thresholds after collecting real runs.</w:t>
+        <w:t>Track supplies Jira completion and status evidence, and planning runs record agent durations. Evaluator compares product KPIs only when baseline and post-change evidence are available.</w:t>
       </w:r>
     </w:p>
     <w:p>

</xml_diff>